<commit_message>
♻️ refactor: remove direct organization relation, use customer.organization instead
</commit_message>
<xml_diff>
--- a/apps/web/templates/XANSHA/HOTEL/Lease Agreement.docx
+++ b/apps/web/templates/XANSHA/HOTEL/Lease Agreement.docx
@@ -335,7 +335,6 @@
       </w:r>
       <w:r>
         <w:t xml:space="preserve">    </w:t>
-        <w:tab/>
       </w:r>
       <w:r>
         <w:rPr>
@@ -520,7 +519,7 @@
           <w:szCs w:val="24"/>
           <w:lang w:val="en-US"/>
         </w:rPr>
-        <w:t xml:space="preserve">organization</w:t>
+        <w:t xml:space="preserve">customer.organization</w:t>
       </w:r>
       <w:r>
         <w:rPr>
@@ -890,7 +889,7 @@
           <w:b w:val="0"/>
           <w:lang w:val="en-US"/>
         </w:rPr>
-        <w:t xml:space="preserve">organization</w:t>
+        <w:t xml:space="preserve">customer.organization</w:t>
       </w:r>
       <w:r>
         <w:rPr>
@@ -2262,7 +2261,7 @@
                 <w:szCs w:val="20"/>
                 <w:lang w:val="en-US"/>
               </w:rPr>
-              <w:t xml:space="preserve">{</w:t>
+              <w:t xml:space="preserve">{customer.</w:t>
             </w:r>
             <w:r>
               <w:rPr>
@@ -2334,7 +2333,7 @@
                 <w:szCs w:val="20"/>
                 <w:lang w:val="en-US"/>
               </w:rPr>
-              <w:t xml:space="preserve">{</w:t>
+              <w:t xml:space="preserve">{customer.</w:t>
             </w:r>
             <w:r>
               <w:rPr>
@@ -2374,7 +2373,7 @@
                 <w:szCs w:val="20"/>
                 <w:lang w:val="en-US"/>
               </w:rPr>
-              <w:t xml:space="preserve">{</w:t>
+              <w:t xml:space="preserve">{customer.</w:t>
             </w:r>
             <w:r>
               <w:rPr>
@@ -2414,7 +2413,7 @@
                 <w:szCs w:val="20"/>
                 <w:lang w:val="en-US"/>
               </w:rPr>
-              <w:t xml:space="preserve">{</w:t>
+              <w:t xml:space="preserve">{customer.</w:t>
             </w:r>
             <w:r>
               <w:rPr>

</xml_diff>